<commit_message>
Control de versiones: CHANGELOG, documento v1.2 y código v0.1.0
Co-Authored-By: Claude Opus 5.5 (1M context) <noreply@anthropic.com>
Claude-Session: https://claude.ai/code/session_01VkQm5RLcZiQMKLCS3EK3og
</commit_message>
<xml_diff>
--- a/docs/Avance1_Documento_Diseno.docx
+++ b/docs/Avance1_Documento_Diseno.docx
@@ -101,6 +101,24 @@
       <w:r>
         <w:t xml:space="preserve">1)</w:t>
       </w:r>
+      <w:r>
+        <w:t xml:space="preserve"> </w:t>
+      </w:r>
+      <w:r>
+        <w:t xml:space="preserve">·</w:t>
+      </w:r>
+      <w:r>
+        <w:t xml:space="preserve"> </w:t>
+      </w:r>
+      <w:r>
+        <w:t xml:space="preserve">Versión</w:t>
+      </w:r>
+      <w:r>
+        <w:t xml:space="preserve"> </w:t>
+      </w:r>
+      <w:r>
+        <w:t xml:space="preserve">1.2</w:t>
+      </w:r>
     </w:p>
     <w:p>
       <w:pPr>
@@ -196,6 +214,239 @@
         <w:t xml:space="preserve">2026</w:t>
       </w:r>
     </w:p>
+    <w:p>
+      <w:pPr>
+        <w:pStyle w:val="FirstParagraph"/>
+      </w:pPr>
+      <w:r>
+        <w:rPr>
+          <w:bCs/>
+          <w:b/>
+        </w:rPr>
+        <w:t xml:space="preserve">Control de versiones</w:t>
+      </w:r>
+    </w:p>
+    <w:tbl>
+      <w:tblPr>
+        <w:tblStyle w:val="Table"/>
+        <w:tblW w:type="pct" w:w="5000"/>
+        <w:tblLook w:firstRow="1" w:lastRow="0" w:firstColumn="0" w:lastColumn="0" w:noHBand="0" w:noVBand="0" w:val="0020"/>
+        <w:jc w:val="start"/>
+        <w:tblBorders>
+          <w:top w:val="single" w:sz="4" w:color="8E9BAB"/>
+          <w:left w:val="single" w:sz="4" w:color="8E9BAB"/>
+          <w:bottom w:val="single" w:sz="4" w:color="8E9BAB"/>
+          <w:right w:val="single" w:sz="4" w:color="8E9BAB"/>
+          <w:insideH w:val="single" w:sz="4" w:color="8E9BAB"/>
+          <w:insideV w:val="single" w:sz="4" w:color="8E9BAB"/>
+        </w:tblBorders>
+      </w:tblPr>
+      <w:tblGrid>
+        <w:gridCol w:w="2640"/>
+        <w:gridCol w:w="2640"/>
+        <w:gridCol w:w="2640"/>
+      </w:tblGrid>
+      <w:tr>
+        <w:trPr>
+          <w:tblHeader w:val="true"/>
+        </w:trPr>
+        <w:tc>
+          <w:tcPr>
+            <w:shd w:val="clear" w:fill="DCE4EE"/>
+          </w:tcPr>
+          <w:p>
+            <w:pPr>
+              <w:pStyle w:val="Compact"/>
+              <w:jc w:val="left"/>
+            </w:pPr>
+            <w:r>
+              <w:rPr>
+                <w:b/>
+                <w:sz w:val="19"/>
+              </w:rPr>
+              <w:t xml:space="preserve">Versión</w:t>
+            </w:r>
+          </w:p>
+        </w:tc>
+        <w:tc>
+          <w:tcPr>
+            <w:shd w:val="clear" w:fill="DCE4EE"/>
+          </w:tcPr>
+          <w:p>
+            <w:pPr>
+              <w:pStyle w:val="Compact"/>
+              <w:jc w:val="left"/>
+            </w:pPr>
+            <w:r>
+              <w:rPr>
+                <w:b/>
+                <w:sz w:val="19"/>
+              </w:rPr>
+              <w:t xml:space="preserve">Fecha</w:t>
+            </w:r>
+          </w:p>
+        </w:tc>
+        <w:tc>
+          <w:tcPr>
+            <w:shd w:val="clear" w:fill="DCE4EE"/>
+          </w:tcPr>
+          <w:p>
+            <w:pPr>
+              <w:pStyle w:val="Compact"/>
+              <w:jc w:val="left"/>
+            </w:pPr>
+            <w:r>
+              <w:rPr>
+                <w:b/>
+                <w:sz w:val="19"/>
+              </w:rPr>
+              <w:t xml:space="preserve">Cambios</w:t>
+            </w:r>
+          </w:p>
+        </w:tc>
+      </w:tr>
+      <w:tr>
+        <w:tc>
+          <w:tcPr/>
+          <w:p>
+            <w:pPr>
+              <w:pStyle w:val="Compact"/>
+              <w:jc w:val="left"/>
+            </w:pPr>
+            <w:r>
+              <w:rPr>
+                <w:sz w:val="19"/>
+              </w:rPr>
+              <w:t xml:space="preserve">1.0</w:t>
+            </w:r>
+          </w:p>
+        </w:tc>
+        <w:tc>
+          <w:tcPr/>
+          <w:p>
+            <w:pPr>
+              <w:pStyle w:val="Compact"/>
+              <w:jc w:val="left"/>
+            </w:pPr>
+            <w:r>
+              <w:rPr>
+                <w:sz w:val="19"/>
+              </w:rPr>
+              <w:t xml:space="preserve">06/10/2026</w:t>
+            </w:r>
+          </w:p>
+        </w:tc>
+        <w:tc>
+          <w:tcPr/>
+          <w:p>
+            <w:pPr>
+              <w:pStyle w:val="Compact"/>
+              <w:jc w:val="left"/>
+            </w:pPr>
+            <w:r>
+              <w:rPr>
+                <w:sz w:val="19"/>
+              </w:rPr>
+              <w:t xml:space="preserve">Primera versión: clases, 15 historias de usuario, 8 prototipos y diagramas de arquitectura, secuencia y navegación</w:t>
+            </w:r>
+          </w:p>
+        </w:tc>
+      </w:tr>
+      <w:tr>
+        <w:tc>
+          <w:tcPr/>
+          <w:p>
+            <w:pPr>
+              <w:pStyle w:val="Compact"/>
+              <w:jc w:val="left"/>
+            </w:pPr>
+            <w:r>
+              <w:rPr>
+                <w:sz w:val="19"/>
+              </w:rPr>
+              <w:t xml:space="preserve">1.1</w:t>
+            </w:r>
+          </w:p>
+        </w:tc>
+        <w:tc>
+          <w:tcPr/>
+          <w:p>
+            <w:pPr>
+              <w:pStyle w:val="Compact"/>
+              <w:jc w:val="left"/>
+            </w:pPr>
+            <w:r>
+              <w:rPr>
+                <w:sz w:val="19"/>
+              </w:rPr>
+              <w:t xml:space="preserve">08/10/2026</w:t>
+            </w:r>
+          </w:p>
+        </w:tc>
+        <w:tc>
+          <w:tcPr/>
+          <w:p>
+            <w:pPr>
+              <w:pStyle w:val="Compact"/>
+              <w:jc w:val="left"/>
+            </w:pPr>
+            <w:r>
+              <w:rPr>
+                <w:sz w:val="19"/>
+              </w:rPr>
+              <w:t xml:space="preserve">Modelo de clases ajustado al material de las semanas 1 a 5 (estilo MultiSports); tabla de temas del curso; hilos, sockets, Swing y BD como arquitectura prevista; historias y prototipo de productos por tipo</w:t>
+            </w:r>
+          </w:p>
+        </w:tc>
+      </w:tr>
+      <w:tr>
+        <w:tc>
+          <w:tcPr/>
+          <w:p>
+            <w:pPr>
+              <w:pStyle w:val="Compact"/>
+              <w:jc w:val="left"/>
+            </w:pPr>
+            <w:r>
+              <w:rPr>
+                <w:sz w:val="19"/>
+              </w:rPr>
+              <w:t xml:space="preserve">1.2</w:t>
+            </w:r>
+          </w:p>
+        </w:tc>
+        <w:tc>
+          <w:tcPr/>
+          <w:p>
+            <w:pPr>
+              <w:pStyle w:val="Compact"/>
+              <w:jc w:val="left"/>
+            </w:pPr>
+            <w:r>
+              <w:rPr>
+                <w:sz w:val="19"/>
+              </w:rPr>
+              <w:t xml:space="preserve">08/10/2026</w:t>
+            </w:r>
+          </w:p>
+        </w:tc>
+        <w:tc>
+          <w:tcPr/>
+          <w:p>
+            <w:pPr>
+              <w:pStyle w:val="Compact"/>
+              <w:jc w:val="left"/>
+            </w:pPr>
+            <w:r>
+              <w:rPr>
+                <w:sz w:val="19"/>
+              </w:rPr>
+              <w:t xml:space="preserve">Se agrega esta tabla de control de versiones</w:t>
+            </w:r>
+          </w:p>
+        </w:tc>
+      </w:tr>
+    </w:tbl>
     <w:bookmarkStart w:id="25" w:name="introducción"/>
     <w:p>
       <w:pPr>

</xml_diff>